<commit_message>
fix: task overhead removed
</commit_message>
<xml_diff>
--- a/report/logs.docx
+++ b/report/logs.docx
@@ -163,6 +163,100 @@
     <w:p>
       <w:r>
         <w:t>Max step time: 2.715537 sec</w:t>
+      </w:r>
+    </w:p>
+    <w:p/>
+    <w:p>
+      <w:r>
+        <w:t>Adding task parallelism (1 task per computation):</w:t>
+      </w:r>
+      <w:r>
+        <w:br/>
+      </w:r>
+    </w:p>
+    <w:p>
+      <w:r>
+        <w:t>===== PERFORMANCE REPORT =====</w:t>
+      </w:r>
+    </w:p>
+    <w:p>
+      <w:r>
+        <w:t>Total runtime:        53.7748 sec</w:t>
+      </w:r>
+    </w:p>
+    <w:p>
+      <w:r>
+        <w:t>Total compute time:   0.1271 sec</w:t>
+      </w:r>
+    </w:p>
+    <w:p>
+      <w:r>
+        <w:t>Total communication:  50.7559 sec</w:t>
+      </w:r>
+    </w:p>
+    <w:p>
+      <w:r>
+        <w:t>Other/overhead:       2.8919 sec</w:t>
+      </w:r>
+    </w:p>
+    <w:p>
+      <w:r>
+        <w:t>=== Monitoring Report ===</w:t>
+      </w:r>
+    </w:p>
+    <w:p>
+      <w:r>
+        <w:t>Total execution time: 53.7779 sec</w:t>
+      </w:r>
+    </w:p>
+    <w:p>
+      <w:r>
+        <w:t>Average step time: 0.107353 sec</w:t>
+      </w:r>
+    </w:p>
+    <w:p>
+      <w:r>
+        <w:t>Max step time: 2.218099 sec</w:t>
+      </w:r>
+    </w:p>
+    <w:p/>
+    <w:p/>
+    <w:p/>
+    <w:p/>
+    <w:p>
+      <w:r>
+        <w:lastRenderedPageBreak/>
+        <w:t>500:</w:t>
+      </w:r>
+    </w:p>
+    <w:p>
+      <w:r>
+        <w:t>===== PERFORMANCE REPORT =====</w:t>
+      </w:r>
+    </w:p>
+    <w:p>
+      <w:r>
+        <w:t>Total runtime:        9.0165 sec</w:t>
+      </w:r>
+    </w:p>
+    <w:p>
+      <w:r>
+        <w:t>Total compute time:   0.8026 sec</w:t>
+      </w:r>
+    </w:p>
+    <w:p>
+      <w:r>
+        <w:t>Total communication:  8.9033 sec</w:t>
+      </w:r>
+    </w:p>
+    <w:p>
+      <w:r>
+        <w:t>Other/overhead:       -0.6894 sec</w:t>
+      </w:r>
+    </w:p>
+    <w:p>
+      <w:r>
+        <w:t>==============================</w:t>
       </w:r>
     </w:p>
     <w:sectPr>

</xml_diff>